<commit_message>
Add Dofbot and x03 writing robots and record scroll-paper runs.
Ship the models and docs so both arms write from the shared entry point, and keep continuous scroll recordings with the writer.

Co-authored-by: Cursor <cursoragent@cursor.com>
</commit_message>
<xml_diff>
--- a/paper/koopman_mpc_soarm101.docx
+++ b/paper/koopman_mpc_soarm101.docx
@@ -50,7 +50,7 @@
           <w:i w:val="0"/>
           <w:sz w:val="21"/>
         </w:rPr>
-        <w:t>Model predictive control (MPC) built on a learned Koopman-operator linearization promises real-time, physics-model-free control of nonlinear robot dynamics, but its practical robustness to observation noise and unmodeled payload disturbances on cheap, backlash-prone hardware is rarely reported. We present an empirical study on the SO-ARM101, a sub-$100, 5-degree-of-freedom hobby manipulator, comparing four Koopman network architectures — a linear encoder (DKUC), a deep bilinear encoder (DBKN), and their invertible-network counterparts (IKN, IBKN) — under a common data-collection and MPC pipeline. We further combine (i) an Unscented Kalman Filter (UKF) operating directly in the learned Koopman-lifted coordinates to counter observation noise, and (ii) a Koopman-space Extended State Observer (KESO) to estimate and feed-forward-compensate unmodeled payload disturbance, rather than the conventional joint-space formulation of Active Disturbance Rejection Control (ADRC). On closed-loop trajectory-tracking experiments we find that architectures with comparable open-loop prediction loss can differ by up to two orders of magnitude in closed-loop tracking error under disturbance, that KESO reduces payload-induced tracking error by roughly 56× and combined noise+payload error by roughly 327× relative to an uncompensated bilinear Koopman-MPC baseline, and that a controller trained purely in simulation transfers to the physical arm and can be repurposed, with only a joint-range widening of the training distribution, to drive the same pipeline through a multi-stroke pen-lift-transit-pen-down motion primitive that reproduces arbitrary Chinese-character stroke data. We report all numbers from logged experiment artifacts and discuss the limits of this study candidly: the theoretical components are individually established in the literature, and the contribution is the specific combination, the systematic architecture ablation, and the sim-to-real validation on affordable hardware.</w:t>
+        <w:t>Model predictive control (MPC) built on a learned Koopman-operator linearization promises real-time, physics-model-free control of nonlinear robot dynamics, but its practical robustness to observation noise and unmodeled payload disturbances on cheap, backlash-prone hardware is rarely reported. We present an empirical study on the SO-ARM101, a sub-$100, 5-degree-of-freedom hobby manipulator, comparing four Koopman network architectures — a linear encoder (DKUC), a deep bilinear encoder (DBKN), and their invertible-network counterparts (IKN, IBKN) — under a common data-collection and MPC pipeline. We further combine (i) an Unscented Kalman Filter (UKF) operating directly in the learned Koopman-lifted coordinates to counter observation noise, and (ii) a Koopman-space Extended State Observer (KESO) to estimate and feed-forward-compensate unmodeled payload disturbance, rather than the conventional joint-space formulation of Active Disturbance Rejection Control (ADRC). On closed-loop trajectory-tracking experiments we find that architectures with comparable open-loop prediction loss can differ by up to two orders of magnitude in closed-loop tracking error under disturbance, that KESO reduces payload-induced tracking error by roughly 17.5× relative to the UKF-only payload condition (0.263 → 0.015) and combined noise+payload error by roughly 330× relative to a fully uncompensated bilinear Koopman-MPC baseline, and that a controller trained purely in simulation transfers to the physical arm and can be repurposed, with only a joint-range widening of the training distribution, to drive the same pipeline through a multi-stroke pen-lift-transit-pen-down motion primitive that reproduces multi-stroke Chinese-character stroke data within reachable, training-covered workspace. We report all numbers from logged experiment artifacts and discuss the limits of this study candidly: the theoretical components are individually established in the literature, and the contribution is the specific combination, the systematic architecture ablation, and the sim-to-real validation on affordable hardware.</w:t>
       </w:r>
     </w:p>
     <w:p>
@@ -108,7 +108,7 @@
           <w:i w:val="0"/>
           <w:sz w:val="21"/>
         </w:rPr>
-        <w:t>This paper makes an applied contribution along both axes on the SO-ARM101 platform, in simulation (MuJoCo [9]) and on the physical arm:</w:t>
+        <w:t>This paper makes an applied contribution along both axes on the SO-ARM101 platform, in simulation (MuJoCo [10]) and on the physical arm:</w:t>
       </w:r>
     </w:p>
     <w:p>
@@ -124,7 +124,7 @@
         <w:pStyle w:val="ListBullet"/>
       </w:pPr>
       <w:r>
-        <w:t>We combine an Unscented Kalman Filter formulated directly in the learned Koopman-lifted coordinates with the bilinear MPC loop to counter observation noise, and separately a Koopman-space Extended State Observer (KESO) — an ADRC-style total-disturbance estimator [8] relocated from joint space into the learned lifted space — to counter unmodeled payload.</w:t>
+        <w:t>We combine an Unscented Kalman Filter formulated directly in the learned Koopman-lifted coordinates with the bilinear MPC loop to counter observation noise, and separately a Koopman-space Extended State Observer (KESO) — an ADRC-style total-disturbance estimator [9] relocated from joint space into the learned lifted space — to counter unmodeled payload.</w:t>
       </w:r>
     </w:p>
     <w:p>
@@ -140,7 +140,7 @@
         <w:pStyle w:val="ListBullet"/>
       </w:pPr>
       <w:r>
-        <w:t>We demonstrate sim-to-real transfer of the resulting controller to the physical SO-ARM101, and, by widening the joint-angle coverage of the training data distribution, repurpose the same pipeline to drive a multi-stroke pen-lift/transit/pen-down motion primitive that reproduces arbitrary Chinese characters from public stroke-order data [11].</w:t>
+        <w:t>We demonstrate sim-to-real transfer of the resulting controller to the physical SO-ARM101, and, by widening the joint-angle coverage of the training data distribution, repurpose the same pipeline to drive a multi-stroke pen-lift/transit/pen-down motion primitive that reproduces multi-stroke Chinese characters from public stroke-order data [12], within the reachable workspace covered by training.</w:t>
       </w:r>
     </w:p>
     <w:p>
@@ -181,7 +181,7 @@
           <w:i w:val="0"/>
           <w:sz w:val="21"/>
         </w:rPr>
-        <w:t>State estimation and disturbance rejection. The Unscented Kalman Filter [8] is the standard nonlinear extension of the Kalman filter; we are not aware of prior work applying it directly inside a learned Koopman-lifted state rather than the physical state. Active Disturbance Rejection Control and its Extended State Observer [8] are classically formulated in the plant's native (typically joint) coordinates; we relocate the observer into the Koopman lifted space so that its correction is consistent with the same coordinates the MPC optimizes over.</w:t>
+        <w:t>State estimation and disturbance rejection. The Unscented Kalman Filter [8] is the standard nonlinear extension of the Kalman filter; placing it in learned Koopman-lifted coordinates that share A, B, H with MPC is an engineering choice of this study (priority relative to other lifted-space filters should be audited separately; we do not claim absolute novelty). Active Disturbance Rejection Control and its Extended State Observer [9] are classically formulated in the plant's native (typically joint) coordinates; we relocate the observer into the Koopman lifted space so that its correction is consistent with the same coordinates the MPC optimizes over.</w:t>
       </w:r>
     </w:p>
     <w:p>
@@ -267,7 +267,7 @@
           <w:i w:val="0"/>
           <w:sz w:val="21"/>
         </w:rPr>
-        <w:t>Given rollouts {(x_t, u_t)} collected by applying random joint-velocity perturbations within a bounded range around a home configuration in MuJoCo, we train θ, A, B, (H) by unrolling Eq. (1) for P steps from a random start index and minimizing a loss combining: a Koopman-consistency term (predicted lifted state vs. the encoding of the true next state), a weighted prediction term (decoded prediction vs. ground truth, orientation upweighted relative to position), a spectral-radius penalty discouraging unstable roll-out of A (eigenvalues held below 0.99 in magnitude), and an L1 penalty on H discouraging spurious state-control coupling. For non-invertible architectures an additional autoencoder reconstruction term is included; for IKN/IBKN this term is identically zero by construction and is omitted.</w:t>
+        <w:t>Given rollouts {(x_t, u_t)} collected by applying random joint-velocity perturbations within a bounded range around a home configuration in MuJoCo, we train θ, A, B, (H) by unrolling Eq. (1) for P steps from a random start index and minimizing a loss combining: a Koopman-consistency term (predicted lifted state vs. the encoding of the true next state), a weighted prediction term (decoded prediction vs. ground truth, orientation upweighted relative to position), a soft spectral-radius penalty on A (discouraging eigenvalues with magnitude above 0.99; not a hard stability certificate for the controlled bilinear system). An L1 penalty on H is logged in the current codebase but is not added to the backpropagated total loss. For DKUC/DBKN the state is recovered by a fixed projection (no trained decoder); a reconstruction term applies only when a trainable decoder is enabled. For IKN/IBKN the inverse is available in closed form and no reconstruction loss is used.</w:t>
       </w:r>
     </w:p>
     <w:p>
@@ -288,7 +288,7 @@
           <w:i w:val="0"/>
           <w:sz w:val="21"/>
         </w:rPr>
-        <w:t>At each control step, the current lifted state z_0 = φθ(x_0) is obtained, the bilinear term in Eq. (1) is linearized about z_0 (i.e. B_eff = B + Σ_j z_{0,j} H_j is held fixed over the horizon), and a horizon-H_p quadratic program minimizing weighted tracking error plus control effort, subject to Eq. (1), is solved with CasADi [10]; only the first control is applied (receding horizon), and the reference is obtained by lifting a Cartesian reference trajectory computed offline via inverse kinematics.</w:t>
+        <w:t>At each control step, the current lifted state z_0 = φθ(x_0) is obtained, the bilinear term in Eq. (1) is linearized about z_0 (i.e. B_eff = B + Σ_j z_{0,j} H_j is held fixed over the horizon), and a horizon-H_p quadratic program minimizing weighted tracking error plus control effort, subject to Eq. (1), is solved with CasADi [11]; only the first control is applied (receding horizon), and the reference is obtained by lifting a Cartesian reference trajectory computed offline via inverse kinematics.</w:t>
       </w:r>
     </w:p>
     <w:p>
@@ -330,7 +330,7 @@
           <w:i w:val="0"/>
           <w:sz w:val="21"/>
         </w:rPr>
-        <w:t>To counter an unmodeled, slowly-varying disturbance (e.g. an attached payload), we augment Eq. (1) with a total-disturbance state d_t ∈ Rᴺ that evolves as a random walk, and run a Luenberger-style observer on the augmented system to obtain an estimate, which is then subtracted as a feed-forward correction in the MPC control law — an Extended State Observer in the spirit of ADRC [8], but operating on the learned lifted coordinates z instead of the physical joint coordinates.</w:t>
+        <w:t>To counter an unmodeled, slowly-varying disturbance (e.g. an attached payload), we augment Eq. (1) with a total-disturbance state d_t ∈ Rᴺ that evolves as a random walk, and run a Luenberger-style observer on the augmented system to obtain an estimate, which is then subtracted as a feed-forward correction in the MPC control law — an Extended State Observer in the spirit of ADRC [9], but operating on the learned lifted coordinates z instead of the physical joint coordinates.</w:t>
       </w:r>
     </w:p>
     <w:p>
@@ -987,7 +987,7 @@
           <w:i w:val="0"/>
           <w:sz w:val="21"/>
         </w:rPr>
-        <w:t>Under an added payload, uncompensated bilinear Koopman-MPC tracking error increases by more than two orders of magnitude relative to the disturbance-free baseline (0.037 → 4.904). KESO reduces this back down by ~56× relative to the uncompensated-with-UKF payload condition (0.263 → 0.0150, essentially recovering baseline-level tracking), and the combined noise+payload condition is reduced by ~327× relative to the fully uncompensated case (4.967 → 0.0152). Observation-noise-only degradation is comfortably handled by the UKF alone (0.237 → 0.022, a ~11× reduction), consistent with UKF and KESO addressing distinct failure modes (noisy measurement vs. unmodeled plant mismatch) that compound when both are present.</w:t>
+        <w:t>Under an added payload, uncompensated bilinear Koopman-MPC tracking error increases by more than two orders of magnitude relative to the disturbance-free baseline (0.037 → 4.904). KESO reduces this back down by ~17.5× relative to the UKF-only payload condition (0.263 → 0.015, essentially recovering baseline-level tracking), and the combined noise+payload condition is reduced by ~330× relative to the fully uncompensated case (4.967 → 0.015). Observation-noise-only degradation is comfortably handled by the UKF alone (0.237 → 0.022, a ~11× reduction), consistent with UKF and KESO addressing distinct failure modes (noisy measurement vs. unmodeled plant mismatch) that compound when both are present.</w:t>
       </w:r>
     </w:p>
     <w:p>
@@ -1008,7 +1008,7 @@
           <w:i w:val="0"/>
           <w:sz w:val="21"/>
         </w:rPr>
-        <w:t>The controller trained purely in MuJoCo was deployed unmodified (beyond a one-time per-joint calibration-offset correction between the simulated and physical zero references) to the physical SO-ARM101 over the ZMQ bridge. Widening the training distribution's joint-angle coverage (Sec. IV) extended the same DBKN-MPC pipeline from the original vertical-plane figures to table-plane strokes; combined with a pen-lift → transit → pen-lower motion primitive inserted between strokes (each stroke and transit segment IK-solved with the same solver, so the resulting reference remains kinematically consistent), the pipeline reproduced multi-stroke Chinese characters sourced from public stroke-order data [11]. Table IV reports tracking error for representative test shapes; simpler, smaller-excursion shapes (a cross, the character 十) track substantially better than characters whose strokes push closer to the edge of the widened training distribution (二, 常), consistent with the closed-loop-robustness-depends-on-training-coverage finding above.</w:t>
+        <w:t>The controller trained purely in MuJoCo was deployed unmodified (beyond a one-time per-joint calibration-offset correction between the simulated and physical zero references) to the physical SO-ARM101 over the ZMQ bridge. Widening the training distribution's joint-angle coverage (Sec. IV) extended the same DBKN-MPC pipeline from the original vertical-plane figures to table-plane strokes; combined with a pen-lift → transit → pen-lower motion primitive inserted between strokes (each stroke and transit segment IK-solved with the same solver, so the resulting reference remains kinematically consistent), the pipeline reproduced multi-stroke Chinese characters sourced from public stroke-order data [12]. Table IV reports tracking error for representative test shapes; simpler, smaller-excursion shapes (a cross, the character 十) track substantially better than characters whose strokes push closer to the edge of the widened training distribution (二, 常), consistent with the closed-loop-robustness-depends-on-training-coverage finding above.</w:t>
       </w:r>
     </w:p>
     <w:p>
@@ -1349,6 +1349,12 @@
         <w:t>[12] C. Chan, “hanzi-writer-data,” derived from the Make Me a Hanzi project. https://github.com/chanind/hanzi-writer-data</w:t>
       </w:r>
     </w:p>
+    <w:p/>
+    <w:p>
+      <w:r>
+        <w:t>Note on Chinese full manuscript / 中文完整稿. A merged Chinese manuscript that also covers multi-arm handwriting (Piper / WheelArmR / X02), YAML-based robot onboarding, corrected disturbance-rejection ratios (~17.5× for 0.263→0.015), loss-function wording aligned with the repository, and citation numbering (UKF [8], ADRC [9], MuJoCo [10], CasADi [11], stroke data [12]) is provided as paper/koopman_mpc_多机械臂书写_中文.docx (source: paper/全文_双线性Koopman_MPC多机械臂书写.md).</w:t>
+      </w:r>
+    </w:p>
     <w:sectPr>
       <w:pgSz w:w="11906" w:h="16838"/>
       <w:pgMar w:top="1247" w:right="1247" w:bottom="1247" w:left="1247" w:header="720" w:footer="720" w:gutter="0"/>

</xml_diff>